<commit_message>
feat(slides): add "Access the Hands-On Labs" slide with clickable GitHub repo link
- New visual slide (labs_access) pointing learners to the course GitHub repo,
  with the repo URL as a REAL clickable hyperlink, plus clone / download-ZIP
  option cards and a Killercoda note; placed after the workbench slide
- course_content: add the GitHub repo URL to the single source
- wsq-slides skill: add Required Element 10 (Access the Labs slide — clickable
  repo link) + canonical-order entry (user + project level)
- Rebuild deck (319 slides) + slide_map; rebuild LP with updated slide numbers
- README: reflect 319-slide count

Co-Authored-By: Claude Opus 4.8 (1M context) <noreply@anthropic.com>
</commit_message>
<xml_diff>
--- a/courseware/LP-CompTIA-Linux-Plus-XK0-006.docx
+++ b/courseware/LP-CompTIA-Linux-Plus-XK0-006.docx
@@ -1079,7 +1079,7 @@
                 <w:b w:val="0"/>
                 <w:sz w:val="19"/>
               </w:rPr>
-              <w:t>20–88</w:t>
+              <w:t>21–89</w:t>
             </w:r>
           </w:p>
         </w:tc>
@@ -1155,7 +1155,7 @@
                 <w:b w:val="0"/>
                 <w:sz w:val="19"/>
               </w:rPr>
-              <w:t>86–147</w:t>
+              <w:t>87–148</w:t>
             </w:r>
           </w:p>
         </w:tc>
@@ -1231,7 +1231,7 @@
                 <w:b w:val="0"/>
                 <w:sz w:val="19"/>
               </w:rPr>
-              <w:t>145–206</w:t>
+              <w:t>146–207</w:t>
             </w:r>
           </w:p>
         </w:tc>
@@ -1307,7 +1307,7 @@
                 <w:b w:val="0"/>
                 <w:sz w:val="19"/>
               </w:rPr>
-              <w:t>204–255</w:t>
+              <w:t>205–256</w:t>
             </w:r>
           </w:p>
         </w:tc>
@@ -1383,7 +1383,7 @@
                 <w:b w:val="0"/>
                 <w:sz w:val="19"/>
               </w:rPr>
-              <w:t>253–318</w:t>
+              <w:t>254–319</w:t>
             </w:r>
           </w:p>
         </w:tc>
@@ -1782,7 +1782,7 @@
                 <w:b w:val="0"/>
                 <w:sz w:val="19"/>
               </w:rPr>
-              <w:t>20–65</w:t>
+              <w:t>21–66</w:t>
             </w:r>
           </w:p>
         </w:tc>
@@ -1957,7 +1957,7 @@
                 <w:b w:val="0"/>
                 <w:sz w:val="19"/>
               </w:rPr>
-              <w:t>66–88</w:t>
+              <w:t>67–89</w:t>
             </w:r>
           </w:p>
         </w:tc>
@@ -2132,7 +2132,7 @@
                 <w:b w:val="0"/>
                 <w:sz w:val="19"/>
               </w:rPr>
-              <w:t>86–147</w:t>
+              <w:t>87–148</w:t>
             </w:r>
           </w:p>
         </w:tc>
@@ -2613,7 +2613,7 @@
                 <w:b w:val="0"/>
                 <w:sz w:val="19"/>
               </w:rPr>
-              <w:t>145–206</w:t>
+              <w:t>146–207</w:t>
             </w:r>
           </w:p>
         </w:tc>
@@ -2788,7 +2788,7 @@
                 <w:b w:val="0"/>
                 <w:sz w:val="19"/>
               </w:rPr>
-              <w:t>204–255</w:t>
+              <w:t>205–256</w:t>
             </w:r>
           </w:p>
         </w:tc>
@@ -2963,7 +2963,7 @@
                 <w:b w:val="0"/>
                 <w:sz w:val="19"/>
               </w:rPr>
-              <w:t>253–300</w:t>
+              <w:t>254–301</w:t>
             </w:r>
           </w:p>
         </w:tc>
@@ -3048,7 +3048,7 @@
                 <w:b w:val="0"/>
                 <w:sz w:val="19"/>
               </w:rPr>
-              <w:t>301–318</w:t>
+              <w:t>302–319</w:t>
             </w:r>
           </w:p>
         </w:tc>
@@ -3359,7 +3359,7 @@
         <w:pStyle w:val="Heading2"/>
       </w:pPr>
       <w:r>
-        <w:t>Domain 1 — System Management (23%)  ·  Slides 20–88</w:t>
+        <w:t>Domain 1 — System Management (23%)  ·  Slides 21–89</w:t>
       </w:r>
     </w:p>
     <w:p>
@@ -3370,7 +3370,7 @@
           <w:color w:val="C8102E"/>
           <w:sz w:val="21"/>
         </w:rPr>
-        <w:t>Lab 1 — Boot Process &amp; Filesystem Hierarchy  [Obj 1.1]  ·  Slide 23</w:t>
+        <w:t>Lab 1 — Boot Process &amp; Filesystem Hierarchy  [Obj 1.1]  ·  Slide 24</w:t>
       </w:r>
     </w:p>
     <w:p>
@@ -3392,7 +3392,7 @@
           <w:color w:val="C8102E"/>
           <w:sz w:val="21"/>
         </w:rPr>
-        <w:t>Lab 2 — Kernel Modules &amp; Device Management  [Obj 1.2]  ·  Slide 31</w:t>
+        <w:t>Lab 2 — Kernel Modules &amp; Device Management  [Obj 1.2]  ·  Slide 32</w:t>
       </w:r>
     </w:p>
     <w:p>
@@ -3414,7 +3414,7 @@
           <w:color w:val="C8102E"/>
           <w:sz w:val="21"/>
         </w:rPr>
-        <w:t>Lab 3 — Storage with LVM, Partitions &amp; Filesystems  [Obj 1.3]  ·  Slide 40</w:t>
+        <w:t>Lab 3 — Storage with LVM, Partitions &amp; Filesystems  [Obj 1.3]  ·  Slide 41</w:t>
       </w:r>
     </w:p>
     <w:p>
@@ -3436,7 +3436,7 @@
           <w:color w:val="C8102E"/>
           <w:sz w:val="21"/>
         </w:rPr>
-        <w:t>Lab 4 — Network Configuration  [Obj 1.4]  ·  Slide 48</w:t>
+        <w:t>Lab 4 — Network Configuration  [Obj 1.4]  ·  Slide 49</w:t>
       </w:r>
     </w:p>
     <w:p>
@@ -3458,7 +3458,7 @@
           <w:color w:val="C8102E"/>
           <w:sz w:val="21"/>
         </w:rPr>
-        <w:t>Lab 5 — Shell Operations &amp; Text Processing  [Obj 1.5]  ·  Slide 57</w:t>
+        <w:t>Lab 5 — Shell Operations &amp; Text Processing  [Obj 1.5]  ·  Slide 58</w:t>
       </w:r>
     </w:p>
     <w:p>
@@ -3480,7 +3480,7 @@
           <w:color w:val="C8102E"/>
           <w:sz w:val="21"/>
         </w:rPr>
-        <w:t>Lab 6 — Backup &amp; Restore  [Obj 1.6]  ·  Slide 66</w:t>
+        <w:t>Lab 6 — Backup &amp; Restore  [Obj 1.6]  ·  Slide 67</w:t>
       </w:r>
     </w:p>
     <w:p>
@@ -3502,7 +3502,7 @@
           <w:color w:val="C8102E"/>
           <w:sz w:val="21"/>
         </w:rPr>
-        <w:t>Lab 7 — Virtualization with QEMU/KVM &amp; libvirt  [Obj 1.7]  ·  Slide 75</w:t>
+        <w:t>Lab 7 — Virtualization with QEMU/KVM &amp; libvirt  [Obj 1.7]  ·  Slide 76</w:t>
       </w:r>
     </w:p>
     <w:p>
@@ -3521,7 +3521,7 @@
         <w:pStyle w:val="Heading2"/>
       </w:pPr>
       <w:r>
-        <w:t>Domain 2 — Services and User Management (20%)  ·  Slides 86–147</w:t>
+        <w:t>Domain 2 — Services and User Management (20%)  ·  Slides 87–148</w:t>
       </w:r>
     </w:p>
     <w:p>
@@ -3532,7 +3532,7 @@
           <w:color w:val="C8102E"/>
           <w:sz w:val="21"/>
         </w:rPr>
-        <w:t>Lab 8 — File &amp; Directory Management  [Obj 2.1]  ·  Slide 89</w:t>
+        <w:t>Lab 8 — File &amp; Directory Management  [Obj 2.1]  ·  Slide 90</w:t>
       </w:r>
     </w:p>
     <w:p>
@@ -3554,7 +3554,7 @@
           <w:color w:val="C8102E"/>
           <w:sz w:val="21"/>
         </w:rPr>
-        <w:t>Lab 9 — Local Account &amp; Group Management  [Obj 2.2]  ·  Slide 98</w:t>
+        <w:t>Lab 9 — Local Account &amp; Group Management  [Obj 2.2]  ·  Slide 99</w:t>
       </w:r>
     </w:p>
     <w:p>
@@ -3576,7 +3576,7 @@
           <w:color w:val="C8102E"/>
           <w:sz w:val="21"/>
         </w:rPr>
-        <w:t>Lab 10 — Processes, Jobs &amp; Scheduling  [Obj 2.3]  ·  Slide 107</w:t>
+        <w:t>Lab 10 — Processes, Jobs &amp; Scheduling  [Obj 2.3]  ·  Slide 108</w:t>
       </w:r>
     </w:p>
     <w:p>
@@ -3598,7 +3598,7 @@
           <w:color w:val="C8102E"/>
           <w:sz w:val="21"/>
         </w:rPr>
-        <w:t>Lab 11 — Software &amp; Package Management  [Obj 2.4]  ·  Slide 116</w:t>
+        <w:t>Lab 11 — Software &amp; Package Management  [Obj 2.4]  ·  Slide 117</w:t>
       </w:r>
     </w:p>
     <w:p>
@@ -3620,7 +3620,7 @@
           <w:color w:val="C8102E"/>
           <w:sz w:val="21"/>
         </w:rPr>
-        <w:t>Lab 12 — Service Management with systemd  [Obj 2.5]  ·  Slide 125</w:t>
+        <w:t>Lab 12 — Service Management with systemd  [Obj 2.5]  ·  Slide 126</w:t>
       </w:r>
     </w:p>
     <w:p>
@@ -3642,7 +3642,7 @@
           <w:color w:val="C8102E"/>
           <w:sz w:val="21"/>
         </w:rPr>
-        <w:t>Lab 13 — Containers with Docker &amp; Podman  [Obj 2.6]  ·  Slide 134</w:t>
+        <w:t>Lab 13 — Containers with Docker &amp; Podman  [Obj 2.6]  ·  Slide 135</w:t>
       </w:r>
     </w:p>
     <w:p>
@@ -3661,7 +3661,7 @@
         <w:pStyle w:val="Heading2"/>
       </w:pPr>
       <w:r>
-        <w:t>Domain 3 — Security (18%)  ·  Slides 145–206</w:t>
+        <w:t>Domain 3 — Security (18%)  ·  Slides 146–207</w:t>
       </w:r>
     </w:p>
     <w:p>
@@ -3672,7 +3672,7 @@
           <w:color w:val="C8102E"/>
           <w:sz w:val="21"/>
         </w:rPr>
-        <w:t>Lab 14 — AAA: sudo, PAM, and Polkit  [Obj 3.1]  ·  Slide 148</w:t>
+        <w:t>Lab 14 — AAA: sudo, PAM, and Polkit  [Obj 3.1]  ·  Slide 149</w:t>
       </w:r>
     </w:p>
     <w:p>
@@ -3694,7 +3694,7 @@
           <w:color w:val="C8102E"/>
           <w:sz w:val="21"/>
         </w:rPr>
-        <w:t>Lab 15 — Firewalls: ufw, firewalld, iptables, nftables, ipset  [Obj 3.2]  ·  Slide 157</w:t>
+        <w:t>Lab 15 — Firewalls: ufw, firewalld, iptables, nftables, ipset  [Obj 3.2]  ·  Slide 158</w:t>
       </w:r>
     </w:p>
     <w:p>
@@ -3716,7 +3716,7 @@
           <w:color w:val="C8102E"/>
           <w:sz w:val="21"/>
         </w:rPr>
-        <w:t>Lab 16 — OS Hardening: Permissions, SELinux, SSH, Fail2ban  [Obj 3.3]  ·  Slide 166</w:t>
+        <w:t>Lab 16 — OS Hardening: Permissions, SELinux, SSH, Fail2ban  [Obj 3.3]  ·  Slide 167</w:t>
       </w:r>
     </w:p>
     <w:p>
@@ -3738,7 +3738,7 @@
           <w:color w:val="C8102E"/>
           <w:sz w:val="21"/>
         </w:rPr>
-        <w:t>Lab 17 — Account Hardening  [Obj 3.4]  ·  Slide 175</w:t>
+        <w:t>Lab 17 — Account Hardening  [Obj 3.4]  ·  Slide 176</w:t>
       </w:r>
     </w:p>
     <w:p>
@@ -3760,7 +3760,7 @@
           <w:color w:val="C8102E"/>
           <w:sz w:val="21"/>
         </w:rPr>
-        <w:t>Lab 18 — Cryptography: GPG, LUKS, OpenSSL, WireGuard  [Obj 3.5]  ·  Slide 184</w:t>
+        <w:t>Lab 18 — Cryptography: GPG, LUKS, OpenSSL, WireGuard  [Obj 3.5]  ·  Slide 185</w:t>
       </w:r>
     </w:p>
     <w:p>
@@ -3782,7 +3782,7 @@
           <w:color w:val="C8102E"/>
           <w:sz w:val="21"/>
         </w:rPr>
-        <w:t>Lab 19 — Compliance, Auditing, and File Integrity  [Obj 3.6]  ·  Slide 193</w:t>
+        <w:t>Lab 19 — Compliance, Auditing, and File Integrity  [Obj 3.6]  ·  Slide 194</w:t>
       </w:r>
     </w:p>
     <w:p>
@@ -3801,7 +3801,7 @@
         <w:pStyle w:val="Heading2"/>
       </w:pPr>
       <w:r>
-        <w:t>Domain 4 — Automation, Orchestration, and Scripting (17%)  ·  Slides 204–255</w:t>
+        <w:t>Domain 4 — Automation, Orchestration, and Scripting (17%)  ·  Slides 205–256</w:t>
       </w:r>
     </w:p>
     <w:p>
@@ -3812,7 +3812,7 @@
           <w:color w:val="C8102E"/>
           <w:sz w:val="21"/>
         </w:rPr>
-        <w:t>Lab 20 — Infrastructure as Code with Ansible  [Obj 4.1]  ·  Slide 207</w:t>
+        <w:t>Lab 20 — Infrastructure as Code with Ansible  [Obj 4.1]  ·  Slide 208</w:t>
       </w:r>
     </w:p>
     <w:p>
@@ -3834,7 +3834,7 @@
           <w:color w:val="C8102E"/>
           <w:sz w:val="21"/>
         </w:rPr>
-        <w:t>Lab 21 — Bash Scripting  [Obj 4.2]  ·  Slide 215</w:t>
+        <w:t>Lab 21 — Bash Scripting  [Obj 4.2]  ·  Slide 216</w:t>
       </w:r>
     </w:p>
     <w:p>
@@ -3856,7 +3856,7 @@
           <w:color w:val="C8102E"/>
           <w:sz w:val="21"/>
         </w:rPr>
-        <w:t>Lab 22 — Python for System Administration  [Obj 4.3]  ·  Slide 224</w:t>
+        <w:t>Lab 22 — Python for System Administration  [Obj 4.3]  ·  Slide 225</w:t>
       </w:r>
     </w:p>
     <w:p>
@@ -3878,7 +3878,7 @@
           <w:color w:val="C8102E"/>
           <w:sz w:val="21"/>
         </w:rPr>
-        <w:t>Lab 23 — Git Version Control  [Obj 4.4]  ·  Slide 233</w:t>
+        <w:t>Lab 23 — Git Version Control  [Obj 4.4]  ·  Slide 234</w:t>
       </w:r>
     </w:p>
     <w:p>
@@ -3900,7 +3900,7 @@
           <w:color w:val="C8102E"/>
           <w:sz w:val="21"/>
         </w:rPr>
-        <w:t>Lab 24 — Responsible AI Use for Linux Administrators  [Obj 4.5]  ·  Slide 242</w:t>
+        <w:t>Lab 24 — Responsible AI Use for Linux Administrators  [Obj 4.5]  ·  Slide 243</w:t>
       </w:r>
     </w:p>
     <w:p>
@@ -3919,7 +3919,7 @@
         <w:pStyle w:val="Heading2"/>
       </w:pPr>
       <w:r>
-        <w:t>Domain 5 — Troubleshooting (22%)  ·  Slides 253–318</w:t>
+        <w:t>Domain 5 — Troubleshooting (22%)  ·  Slides 254–319</w:t>
       </w:r>
     </w:p>
     <w:p>
@@ -3930,7 +3930,7 @@
           <w:color w:val="C8102E"/>
           <w:sz w:val="21"/>
         </w:rPr>
-        <w:t>Lab 25 — Monitoring Concepts and Tools  [Obj 5.1]  ·  Slide 256</w:t>
+        <w:t>Lab 25 — Monitoring Concepts and Tools  [Obj 5.1]  ·  Slide 257</w:t>
       </w:r>
     </w:p>
     <w:p>
@@ -3952,7 +3952,7 @@
           <w:color w:val="C8102E"/>
           <w:sz w:val="21"/>
         </w:rPr>
-        <w:t>Lab 26 — Troubleshooting Hardware, Storage, and OS Issues  [Obj 5.2]  ·  Slide 265</w:t>
+        <w:t>Lab 26 — Troubleshooting Hardware, Storage, and OS Issues  [Obj 5.2]  ·  Slide 266</w:t>
       </w:r>
     </w:p>
     <w:p>
@@ -3974,7 +3974,7 @@
           <w:color w:val="C8102E"/>
           <w:sz w:val="21"/>
         </w:rPr>
-        <w:t>Lab 27 — Troubleshooting Network Connectivity  [Obj 5.3]  ·  Slide 274</w:t>
+        <w:t>Lab 27 — Troubleshooting Network Connectivity  [Obj 5.3]  ·  Slide 275</w:t>
       </w:r>
     </w:p>
     <w:p>
@@ -3996,7 +3996,7 @@
           <w:color w:val="C8102E"/>
           <w:sz w:val="21"/>
         </w:rPr>
-        <w:t>Lab 28 — Troubleshooting Security Issues  [Obj 5.4]  ·  Slide 283</w:t>
+        <w:t>Lab 28 — Troubleshooting Security Issues  [Obj 5.4]  ·  Slide 284</w:t>
       </w:r>
     </w:p>
     <w:p>
@@ -4018,7 +4018,7 @@
           <w:color w:val="C8102E"/>
           <w:sz w:val="21"/>
         </w:rPr>
-        <w:t>Lab 29 — Troubleshooting Performance Issues  [Obj 5.5]  ·  Slide 292</w:t>
+        <w:t>Lab 29 — Troubleshooting Performance Issues  [Obj 5.5]  ·  Slide 293</w:t>
       </w:r>
     </w:p>
     <w:p>
@@ -4040,7 +4040,7 @@
           <w:color w:val="C8102E"/>
           <w:sz w:val="21"/>
         </w:rPr>
-        <w:t>Lab 30 — Capstone: End-to-End Server Build and Triage  [Obj Capstone]  ·  Slide 301</w:t>
+        <w:t>Lab 30 — Capstone: End-to-End Server Build and Triage  [Obj Capstone]  ·  Slide 302</w:t>
       </w:r>
     </w:p>
     <w:p>

</xml_diff>